<commit_message>
Documentation Updated to Include AWS and Mobile Topics
</commit_message>
<xml_diff>
--- a/docs/Tec.docx
+++ b/docs/Tec.docx
@@ -464,7 +464,23 @@
           <w:bCs w:val="0"/>
           <w:iCs/>
         </w:rPr>
-        <w:t>O modelo Random Forest consiste em um método de ensemble que combina múltiplas árvores de decisão com o objetivo de melhorar a robustez e a capacidade de generalização do modelo. Nesse método, diversas árvores são treinadas de forma independente a partir de subconjuntos aleatórios dos dados e das variáveis, sendo o resultado final obtido por meio da agregação das previsões individuais.</w:t>
+        <w:t xml:space="preserve">O modelo Random Forest consiste em um método de ensemble que combina múltiplas árvores de decisão com o objetivo de melhorar a robustez e a capacidade de generalização do modelo. Nesse método, diversas árvores são treinadas de forma independente a partir de subconjuntos aleatórios dos dados e das variáveis, sendo o </w:t>
+      </w:r>
+      <w:proofErr w:type="gramStart"/>
+      <w:r>
+        <w:rPr>
+          <w:bCs w:val="0"/>
+          <w:iCs/>
+        </w:rPr>
+        <w:t>resultado final</w:t>
+      </w:r>
+      <w:proofErr w:type="gramEnd"/>
+      <w:r>
+        <w:rPr>
+          <w:bCs w:val="0"/>
+          <w:iCs/>
+        </w:rPr>
+        <w:t xml:space="preserve"> obtido por meio da agregação das previsões individuais.</w:t>
       </w:r>
     </w:p>
     <w:p>
@@ -560,7 +576,7 @@
             <v:path o:extrusionok="f" gradientshapeok="t" o:connecttype="rect"/>
             <o:lock v:ext="edit" aspectratio="t"/>
           </v:shapetype>
-          <v:shape id="_x0000_i1057" type="#_x0000_t75" style="width:224.25pt;height:168pt;visibility:visible;mso-wrap-style:square">
+          <v:shape id="_x0000_i1025" type="#_x0000_t75" style="width:224.25pt;height:168pt;visibility:visible;mso-wrap-style:square">
             <v:imagedata r:id="rId8" o:title=""/>
           </v:shape>
         </w:pict>
@@ -576,7 +592,6 @@
           <w:iCs/>
           <w:sz w:val="20"/>
           <w:szCs w:val="20"/>
-          <w:lang w:val="en-US"/>
         </w:rPr>
       </w:pPr>
       <w:r>
@@ -585,7 +600,6 @@
           <w:iCs/>
           <w:sz w:val="20"/>
           <w:szCs w:val="20"/>
-          <w:lang w:val="en-US"/>
         </w:rPr>
         <w:t xml:space="preserve">Fonte: </w:t>
       </w:r>
@@ -598,10 +612,22 @@
             <w:sz w:val="20"/>
             <w:szCs w:val="20"/>
             <w:u w:val="none"/>
-            <w:lang w:val="en-US"/>
           </w:rPr>
-          <w:t>Will Koehrsen</w:t>
+          <w:t xml:space="preserve">Will </w:t>
         </w:r>
+        <w:proofErr w:type="spellStart"/>
+        <w:r>
+          <w:rPr>
+            <w:rStyle w:val="Hyperlink"/>
+            <w:iCs/>
+            <w:color w:val="auto"/>
+            <w:sz w:val="20"/>
+            <w:szCs w:val="20"/>
+            <w:u w:val="none"/>
+          </w:rPr>
+          <w:t>Koehrsen</w:t>
+        </w:r>
+        <w:proofErr w:type="spellEnd"/>
       </w:hyperlink>
       <w:r>
         <w:rPr>
@@ -609,20 +635,20 @@
           <w:iCs/>
           <w:sz w:val="20"/>
           <w:szCs w:val="20"/>
-          <w:lang w:val="en-US"/>
-        </w:rPr>
-        <w:t xml:space="preserve"> / M</w:t>
-      </w:r>
+        </w:rPr>
+        <w:t xml:space="preserve"> / </w:t>
+      </w:r>
+      <w:proofErr w:type="spellStart"/>
       <w:r>
         <w:rPr>
           <w:bCs w:val="0"/>
           <w:iCs/>
           <w:sz w:val="20"/>
           <w:szCs w:val="20"/>
-          <w:lang w:val="en-US"/>
-        </w:rPr>
-        <w:t>edium</w:t>
-      </w:r>
+        </w:rPr>
+        <w:t>Medium</w:t>
+      </w:r>
+      <w:proofErr w:type="spellEnd"/>
     </w:p>
     <w:p>
       <w:pPr>
@@ -632,17 +658,17 @@
         <w:rPr>
           <w:b/>
           <w:iCs/>
-          <w:lang w:val="en-US"/>
-        </w:rPr>
-      </w:pPr>
+        </w:rPr>
+      </w:pPr>
+      <w:proofErr w:type="spellStart"/>
       <w:r>
         <w:rPr>
           <w:b/>
           <w:iCs/>
-          <w:lang w:val="en-US"/>
         </w:rPr>
         <w:t>Boosting</w:t>
       </w:r>
+      <w:proofErr w:type="spellEnd"/>
     </w:p>
     <w:p>
       <w:pPr>
@@ -1465,7 +1491,7 @@
       </w:pPr>
       <w:r>
         <w:pict w14:anchorId="54FC83F7">
-          <v:shape id="Imagem 1" o:spid="_x0000_i1025" type="#_x0000_t75" style="width:230.25pt;height:114.75pt;visibility:visible;mso-wrap-style:square;mso-position-horizontal:absolute;mso-position-horizontal-relative:margin;mso-position-vertical:absolute;mso-position-vertical-relative:margin">
+          <v:shape id="Imagem 1" o:spid="_x0000_i1026" type="#_x0000_t75" style="width:230.25pt;height:114.75pt;visibility:visible;mso-wrap-style:square;mso-position-horizontal:absolute;mso-position-horizontal-relative:margin;mso-position-vertical:absolute;mso-position-vertical-relative:margin">
             <v:imagedata r:id="rId10" o:title=""/>
           </v:shape>
         </w:pict>
@@ -1618,7 +1644,7 @@
       </w:pPr>
       <w:r>
         <w:pict w14:anchorId="40138087">
-          <v:shape id="_x0000_i1030" type="#_x0000_t75" style="width:291pt;height:111.75pt">
+          <v:shape id="_x0000_i1027" type="#_x0000_t75" style="width:291pt;height:111.75pt">
             <v:imagedata r:id="rId11" o:title=""/>
           </v:shape>
         </w:pict>
@@ -1818,8 +1844,7 @@
         <w:spacing w:before="160" w:after="160" w:line="360" w:lineRule="auto"/>
         <w:jc w:val="both"/>
         <w:rPr>
-          <w:bCs w:val="0"/>
-          <w:iCs/>
+          <w:noProof/>
         </w:rPr>
       </w:pPr>
       <w:r>
@@ -1836,13 +1861,793 @@
         <w:t xml:space="preserve"> </w:t>
       </w:r>
     </w:p>
+    <w:p>
+      <w:pPr>
+        <w:autoSpaceDE w:val="0"/>
+        <w:spacing w:before="160" w:after="160" w:line="360" w:lineRule="auto"/>
+        <w:jc w:val="both"/>
+        <w:rPr>
+          <w:noProof/>
+        </w:rPr>
+      </w:pPr>
+    </w:p>
+    <w:p>
+      <w:pPr>
+        <w:autoSpaceDE w:val="0"/>
+        <w:spacing w:before="160" w:after="160" w:line="360" w:lineRule="auto"/>
+        <w:jc w:val="both"/>
+        <w:rPr>
+          <w:noProof/>
+        </w:rPr>
+      </w:pPr>
+    </w:p>
+    <w:p>
+      <w:pPr>
+        <w:autoSpaceDE w:val="0"/>
+        <w:spacing w:before="160" w:after="160" w:line="360" w:lineRule="auto"/>
+        <w:jc w:val="both"/>
+        <w:rPr>
+          <w:bCs w:val="0"/>
+          <w:iCs/>
+        </w:rPr>
+      </w:pPr>
+    </w:p>
+    <w:p>
+      <w:pPr>
+        <w:autoSpaceDE w:val="0"/>
+        <w:spacing w:before="160" w:after="160" w:line="360" w:lineRule="auto"/>
+        <w:jc w:val="both"/>
+        <w:rPr>
+          <w:b/>
+        </w:rPr>
+      </w:pPr>
+      <w:r>
+        <w:rPr>
+          <w:bCs w:val="0"/>
+          <w:iCs/>
+        </w:rPr>
+        <w:br w:type="page"/>
+      </w:r>
+      <w:r>
+        <w:rPr>
+          <w:b/>
+        </w:rPr>
+        <w:lastRenderedPageBreak/>
+        <w:t xml:space="preserve">3.4 </w:t>
+      </w:r>
+      <w:r>
+        <w:rPr>
+          <w:b/>
+        </w:rPr>
+        <w:t>Nuvem AWS</w:t>
+      </w:r>
+    </w:p>
+    <w:p>
+      <w:pPr>
+        <w:autoSpaceDE w:val="0"/>
+        <w:spacing w:before="160" w:after="160" w:line="360" w:lineRule="auto"/>
+        <w:jc w:val="both"/>
+        <w:rPr>
+          <w:bCs w:val="0"/>
+        </w:rPr>
+      </w:pPr>
+      <w:r>
+        <w:rPr>
+          <w:bCs w:val="0"/>
+        </w:rPr>
+        <w:t xml:space="preserve">Com o objetivo de colocar o modelo a disposição constante e livre de oscilações e problemas relacionados a indisponibilidade na área da saúde, que pertence ao campo dos sistemas críticos e a prova de falhas, o armazenamento dos dados coletados, o treinamento do modelo e o armazenamento dos resultados será confiado a um sistema arquitetado dentro da provedora de nuvem </w:t>
+      </w:r>
+      <w:proofErr w:type="spellStart"/>
+      <w:r>
+        <w:rPr>
+          <w:bCs w:val="0"/>
+        </w:rPr>
+        <w:t>Amazon</w:t>
+      </w:r>
+      <w:proofErr w:type="spellEnd"/>
+      <w:r>
+        <w:rPr>
+          <w:bCs w:val="0"/>
+        </w:rPr>
+        <w:t xml:space="preserve"> Web Services (AWS).</w:t>
+      </w:r>
+    </w:p>
+    <w:p>
+      <w:pPr>
+        <w:autoSpaceDE w:val="0"/>
+        <w:spacing w:before="160" w:after="160" w:line="360" w:lineRule="auto"/>
+        <w:jc w:val="both"/>
+        <w:rPr>
+          <w:bCs w:val="0"/>
+        </w:rPr>
+      </w:pPr>
+      <w:r>
+        <w:rPr>
+          <w:bCs w:val="0"/>
+        </w:rPr>
+        <w:t>A AWS, uma das maiores provedoras de sistema de nuvem do mundo, com diversos datacenters distribuídos ao longo do planeta, é a opção mais viável para esse modelo, uma vez que conta com um leque de ferramentas extremamente vasto e a capacidade de escalar seus sistemas de forma extremamente facilitada e automatizada, conforme a necessidade.</w:t>
+      </w:r>
+    </w:p>
+    <w:p>
+      <w:pPr>
+        <w:autoSpaceDE w:val="0"/>
+        <w:spacing w:before="160" w:after="160" w:line="360" w:lineRule="auto"/>
+        <w:jc w:val="both"/>
+        <w:rPr>
+          <w:bCs w:val="0"/>
+        </w:rPr>
+      </w:pPr>
+      <w:r>
+        <w:rPr>
+          <w:bCs w:val="0"/>
+        </w:rPr>
+        <w:t xml:space="preserve">O serviço interno da AWS escolhido para isso foi o Elastic Compute Cloud (EC2), </w:t>
+      </w:r>
+      <w:r>
+        <w:rPr>
+          <w:bCs w:val="0"/>
+        </w:rPr>
+        <w:t xml:space="preserve">ilustrado pela figura 3, </w:t>
+      </w:r>
+      <w:r>
+        <w:rPr>
+          <w:bCs w:val="0"/>
+        </w:rPr>
+        <w:t xml:space="preserve">que permite criar instâncias para fins diversos. Nesse caso em </w:t>
+      </w:r>
+      <w:proofErr w:type="gramStart"/>
+      <w:r>
+        <w:rPr>
+          <w:bCs w:val="0"/>
+        </w:rPr>
+        <w:t>especifico</w:t>
+      </w:r>
+      <w:proofErr w:type="gramEnd"/>
+      <w:r>
+        <w:rPr>
+          <w:bCs w:val="0"/>
+        </w:rPr>
+        <w:t>, foi criada uma instância EC2 com a distribuição Linux Ubuntu. Essa distribuição foi inicializada e configurada para ser capaz de ter controle de versões do código hospedado no GitHub e executar os códigos referentes a atualização do treinamento do modelo e disponibilização dos resultados.</w:t>
+      </w:r>
+    </w:p>
+    <w:p>
+      <w:pPr>
+        <w:autoSpaceDE w:val="0"/>
+        <w:spacing w:before="160" w:after="160" w:line="360" w:lineRule="auto"/>
+        <w:jc w:val="center"/>
+        <w:rPr>
+          <w:bCs w:val="0"/>
+          <w:iCs/>
+          <w:sz w:val="20"/>
+          <w:szCs w:val="20"/>
+        </w:rPr>
+      </w:pPr>
+      <w:r>
+        <w:rPr>
+          <w:bCs w:val="0"/>
+          <w:iCs/>
+          <w:sz w:val="20"/>
+          <w:szCs w:val="20"/>
+        </w:rPr>
+        <w:t xml:space="preserve">Figura </w:t>
+      </w:r>
+      <w:r>
+        <w:rPr>
+          <w:bCs w:val="0"/>
+          <w:iCs/>
+          <w:sz w:val="20"/>
+          <w:szCs w:val="20"/>
+        </w:rPr>
+        <w:t>3</w:t>
+      </w:r>
+      <w:r>
+        <w:rPr>
+          <w:bCs w:val="0"/>
+          <w:iCs/>
+          <w:sz w:val="20"/>
+          <w:szCs w:val="20"/>
+        </w:rPr>
+        <w:t xml:space="preserve">: </w:t>
+      </w:r>
+      <w:r>
+        <w:rPr>
+          <w:bCs w:val="0"/>
+          <w:iCs/>
+          <w:sz w:val="20"/>
+          <w:szCs w:val="20"/>
+        </w:rPr>
+        <w:t>Logotipo do EC2, serviço da AWS</w:t>
+      </w:r>
+    </w:p>
+    <w:p>
+      <w:pPr>
+        <w:autoSpaceDE w:val="0"/>
+        <w:spacing w:before="160" w:after="160" w:line="360" w:lineRule="auto"/>
+        <w:jc w:val="center"/>
+      </w:pPr>
+      <w:r>
+        <w:fldChar w:fldCharType="begin"/>
+      </w:r>
+      <w:r>
+        <w:instrText xml:space="preserve"> INCLUDEPICTURE "https://www.next.inc/uploads/2023/08/amazon_ec2-750x422.jpg" \* MERGEFORMATINET </w:instrText>
+      </w:r>
+      <w:r>
+        <w:fldChar w:fldCharType="separate"/>
+      </w:r>
+      <w:r>
+        <w:pict w14:anchorId="26E828C4">
+          <v:shape id="_x0000_i1028" type="#_x0000_t75" alt="AWS 無料利用枠】 費用ゼロでAWSを使い倒す方法を初心者にわかりやすく徹底解説 | 初めてのAWS | ネクスト株式会社" style="width:222pt;height:125.25pt">
+            <v:imagedata r:id="rId12" r:href="rId13"/>
+          </v:shape>
+        </w:pict>
+      </w:r>
+      <w:r>
+        <w:fldChar w:fldCharType="end"/>
+      </w:r>
+    </w:p>
+    <w:p>
+      <w:pPr>
+        <w:autoSpaceDE w:val="0"/>
+        <w:spacing w:before="160" w:after="160" w:line="360" w:lineRule="auto"/>
+        <w:jc w:val="center"/>
+        <w:rPr>
+          <w:bCs w:val="0"/>
+          <w:iCs/>
+          <w:sz w:val="20"/>
+          <w:szCs w:val="20"/>
+        </w:rPr>
+      </w:pPr>
+      <w:r>
+        <w:rPr>
+          <w:bCs w:val="0"/>
+          <w:iCs/>
+          <w:sz w:val="20"/>
+          <w:szCs w:val="20"/>
+        </w:rPr>
+        <w:t>Fonte: site oficial da AWS</w:t>
+      </w:r>
+    </w:p>
+    <w:p>
+      <w:pPr>
+        <w:autoSpaceDE w:val="0"/>
+        <w:spacing w:before="160" w:after="160" w:line="360" w:lineRule="auto"/>
+        <w:jc w:val="both"/>
+        <w:rPr>
+          <w:bCs w:val="0"/>
+        </w:rPr>
+      </w:pPr>
+      <w:r>
+        <w:rPr>
+          <w:bCs w:val="0"/>
+        </w:rPr>
+        <w:t>O EC2 é um</w:t>
+      </w:r>
+      <w:r>
+        <w:rPr>
+          <w:bCs w:val="0"/>
+        </w:rPr>
+        <w:t>a</w:t>
+      </w:r>
+      <w:r>
+        <w:rPr>
+          <w:bCs w:val="0"/>
+        </w:rPr>
+        <w:t xml:space="preserve"> excelente opção para esse caso devido a sua capacidade de escalonamento em escalabilidade e elasticidade, além de ser extremamente robusto em segurança e disponibilidade. O sistema é munido da capacidade de escalonamento vertical e horizontal dos sistemas, agregando maior capacidade </w:t>
+      </w:r>
+      <w:r>
+        <w:rPr>
+          <w:bCs w:val="0"/>
+        </w:rPr>
+        <w:lastRenderedPageBreak/>
+        <w:t xml:space="preserve">computacional individual e de instâncias, respectivamente, conforme a necessidade, de forma automática. Isso se deve as ferramentas </w:t>
+      </w:r>
+      <w:r>
+        <w:rPr>
+          <w:bCs w:val="0"/>
+        </w:rPr>
+        <w:t xml:space="preserve">como </w:t>
+      </w:r>
+      <w:proofErr w:type="spellStart"/>
+      <w:r>
+        <w:rPr>
+          <w:bCs w:val="0"/>
+        </w:rPr>
+        <w:t>Cloudwatch</w:t>
+      </w:r>
+      <w:proofErr w:type="spellEnd"/>
+      <w:r>
+        <w:rPr>
+          <w:bCs w:val="0"/>
+        </w:rPr>
+        <w:t>, que monitora métricas de tráfego e uso do sistema, permitindo disparar rotinas automatizadas em casos de oscilações bruscas que podem gerar folga ou aperto nas capacidades computacionais atuais do sistema como um todo.</w:t>
+      </w:r>
+    </w:p>
+    <w:p>
+      <w:pPr>
+        <w:autoSpaceDE w:val="0"/>
+        <w:spacing w:before="160" w:after="160" w:line="360" w:lineRule="auto"/>
+        <w:jc w:val="both"/>
+        <w:rPr>
+          <w:bCs w:val="0"/>
+        </w:rPr>
+      </w:pPr>
+      <w:r>
+        <w:rPr>
+          <w:bCs w:val="0"/>
+        </w:rPr>
+        <w:t xml:space="preserve">Posteriormente, como melhorias da infraestrutura caso haja necessidade, a AWS conta com ferramentas especializadas em criar ambientes profissionais para administração e orquestração do ciclo de vida de modelos de inteligência artificial, como o </w:t>
+      </w:r>
+      <w:proofErr w:type="spellStart"/>
+      <w:r>
+        <w:rPr>
+          <w:bCs w:val="0"/>
+        </w:rPr>
+        <w:t>SageMaker</w:t>
+      </w:r>
+      <w:proofErr w:type="spellEnd"/>
+      <w:r>
+        <w:rPr>
+          <w:bCs w:val="0"/>
+        </w:rPr>
+        <w:t xml:space="preserve"> AI. No momento tamanha complexidade não se faz necessária, mas caso a distribuição e a necessidade de treinamento dos modelos se torne exponencialmente mais elaborada, é extremamente simples fazer a migração, sem oferecer o risco de indisponibilidade do serviço para a área da saúde, uma vez que todos os processos podem ser executados paralelamente e a migração feita de forma automática. </w:t>
+      </w:r>
+    </w:p>
+    <w:p>
+      <w:pPr>
+        <w:autoSpaceDE w:val="0"/>
+        <w:spacing w:before="160" w:after="160" w:line="360" w:lineRule="auto"/>
+        <w:jc w:val="both"/>
+        <w:rPr>
+          <w:bCs w:val="0"/>
+        </w:rPr>
+      </w:pPr>
+      <w:r>
+        <w:rPr>
+          <w:bCs w:val="0"/>
+        </w:rPr>
+        <w:t>A disponibilização dos dados gerados ocorre por meio de APIs, que o aplicativo e a página web poderão consumir para construir seus gráficos e métricas, de modo que o gestor possa enxergar de forma clara os resultados gerados pelos modelos.</w:t>
+      </w:r>
+      <w:r>
+        <w:rPr>
+          <w:bCs w:val="0"/>
+        </w:rPr>
+        <w:t xml:space="preserve"> </w:t>
+      </w:r>
+    </w:p>
+    <w:p>
+      <w:pPr>
+        <w:autoSpaceDE w:val="0"/>
+        <w:spacing w:before="160" w:after="160" w:line="360" w:lineRule="auto"/>
+        <w:jc w:val="both"/>
+        <w:rPr>
+          <w:bCs w:val="0"/>
+        </w:rPr>
+      </w:pPr>
+    </w:p>
+    <w:p>
+      <w:pPr>
+        <w:autoSpaceDE w:val="0"/>
+        <w:spacing w:before="160" w:after="160" w:line="360" w:lineRule="auto"/>
+        <w:jc w:val="both"/>
+        <w:rPr>
+          <w:b/>
+        </w:rPr>
+      </w:pPr>
+      <w:r>
+        <w:rPr>
+          <w:bCs w:val="0"/>
+          <w:iCs/>
+        </w:rPr>
+        <w:br w:type="page"/>
+      </w:r>
+      <w:r>
+        <w:rPr>
+          <w:b/>
+        </w:rPr>
+        <w:lastRenderedPageBreak/>
+        <w:t xml:space="preserve">3.4 </w:t>
+      </w:r>
+      <w:r>
+        <w:rPr>
+          <w:b/>
+        </w:rPr>
+        <w:t>Aplicativo Mobile e Web</w:t>
+      </w:r>
+    </w:p>
+    <w:p>
+      <w:pPr>
+        <w:autoSpaceDE w:val="0"/>
+        <w:spacing w:before="160" w:after="160" w:line="360" w:lineRule="auto"/>
+        <w:jc w:val="both"/>
+        <w:rPr>
+          <w:bCs w:val="0"/>
+        </w:rPr>
+      </w:pPr>
+      <w:r>
+        <w:rPr>
+          <w:bCs w:val="0"/>
+        </w:rPr>
+        <w:t>O desenvolvimento do software que irá ter o contato com o gestor utilizou majoritariamente o framework Expo,</w:t>
+      </w:r>
+      <w:r>
+        <w:rPr>
+          <w:bCs w:val="0"/>
+        </w:rPr>
+        <w:t xml:space="preserve"> figura 4,</w:t>
+      </w:r>
+      <w:r>
+        <w:rPr>
+          <w:bCs w:val="0"/>
+        </w:rPr>
+        <w:t xml:space="preserve"> construída sobre o framework </w:t>
+      </w:r>
+      <w:proofErr w:type="spellStart"/>
+      <w:r>
+        <w:rPr>
+          <w:bCs w:val="0"/>
+        </w:rPr>
+        <w:t>React</w:t>
+      </w:r>
+      <w:proofErr w:type="spellEnd"/>
+      <w:r>
+        <w:rPr>
+          <w:bCs w:val="0"/>
+        </w:rPr>
+        <w:t xml:space="preserve"> </w:t>
+      </w:r>
+      <w:proofErr w:type="spellStart"/>
+      <w:r>
+        <w:rPr>
+          <w:bCs w:val="0"/>
+        </w:rPr>
+        <w:t>Native</w:t>
+      </w:r>
+      <w:proofErr w:type="spellEnd"/>
+      <w:r>
+        <w:rPr>
+          <w:bCs w:val="0"/>
+        </w:rPr>
+        <w:t xml:space="preserve">, que por sua vez é baseado na biblioteca </w:t>
+      </w:r>
+      <w:proofErr w:type="spellStart"/>
+      <w:r>
+        <w:rPr>
+          <w:bCs w:val="0"/>
+        </w:rPr>
+        <w:t>React</w:t>
+      </w:r>
+      <w:proofErr w:type="spellEnd"/>
+      <w:r>
+        <w:rPr>
+          <w:bCs w:val="0"/>
+        </w:rPr>
+        <w:t xml:space="preserve"> da linguagem Javascript. A escolha do Expo especificamente se deve a sua capacidade de exportar a interface tanto para web quanto para mobile e criar aplicativos multiplataformas. </w:t>
+      </w:r>
+    </w:p>
+    <w:p>
+      <w:pPr>
+        <w:autoSpaceDE w:val="0"/>
+        <w:spacing w:before="160" w:after="160" w:line="360" w:lineRule="auto"/>
+        <w:jc w:val="center"/>
+        <w:rPr>
+          <w:bCs w:val="0"/>
+          <w:iCs/>
+          <w:sz w:val="20"/>
+          <w:szCs w:val="20"/>
+        </w:rPr>
+      </w:pPr>
+      <w:r>
+        <w:rPr>
+          <w:bCs w:val="0"/>
+          <w:iCs/>
+          <w:sz w:val="20"/>
+          <w:szCs w:val="20"/>
+        </w:rPr>
+        <w:t xml:space="preserve">Figura </w:t>
+      </w:r>
+      <w:r>
+        <w:rPr>
+          <w:bCs w:val="0"/>
+          <w:iCs/>
+          <w:sz w:val="20"/>
+          <w:szCs w:val="20"/>
+        </w:rPr>
+        <w:t>4</w:t>
+      </w:r>
+      <w:r>
+        <w:rPr>
+          <w:bCs w:val="0"/>
+          <w:iCs/>
+          <w:sz w:val="20"/>
+          <w:szCs w:val="20"/>
+        </w:rPr>
+        <w:t xml:space="preserve">: Logotipo </w:t>
+      </w:r>
+      <w:r>
+        <w:rPr>
+          <w:bCs w:val="0"/>
+          <w:iCs/>
+          <w:sz w:val="20"/>
+          <w:szCs w:val="20"/>
+        </w:rPr>
+        <w:t>do framework Expo</w:t>
+      </w:r>
+      <w:r>
+        <w:rPr>
+          <w:bCs w:val="0"/>
+          <w:iCs/>
+          <w:sz w:val="20"/>
+          <w:szCs w:val="20"/>
+        </w:rPr>
+        <w:t xml:space="preserve"> </w:t>
+      </w:r>
+    </w:p>
+    <w:p>
+      <w:pPr>
+        <w:autoSpaceDE w:val="0"/>
+        <w:spacing w:before="160" w:after="160" w:line="360" w:lineRule="auto"/>
+        <w:jc w:val="both"/>
+        <w:rPr>
+          <w:bCs w:val="0"/>
+        </w:rPr>
+      </w:pPr>
+    </w:p>
+    <w:p>
+      <w:pPr>
+        <w:autoSpaceDE w:val="0"/>
+        <w:spacing w:before="160" w:after="160" w:line="360" w:lineRule="auto"/>
+        <w:jc w:val="center"/>
+      </w:pPr>
+      <w:r>
+        <w:fldChar w:fldCharType="begin"/>
+      </w:r>
+      <w:r>
+        <w:instrText xml:space="preserve"> INCLUDEPICTURE "https://play-lh.googleusercontent.com/6Sm-GdKg5y01-G56cBTF3zvuMl3TXXGDZj5k6j3rTzuKV_JDOwzpDbRviLxIZr-4U6xNESnMzajNIDRjd2CbCw" \* MERGEFORMATINET </w:instrText>
+      </w:r>
+      <w:r>
+        <w:fldChar w:fldCharType="separate"/>
+      </w:r>
+      <w:r>
+        <w:pict w14:anchorId="0B32CD41">
+          <v:shape id="_x0000_i1031" type="#_x0000_t75" alt="Expo Go - Apps on Google Play" style="width:123pt;height:123pt">
+            <v:imagedata r:id="rId14" r:href="rId15"/>
+          </v:shape>
+        </w:pict>
+      </w:r>
+      <w:r>
+        <w:fldChar w:fldCharType="end"/>
+      </w:r>
+    </w:p>
+    <w:p>
+      <w:pPr>
+        <w:autoSpaceDE w:val="0"/>
+        <w:spacing w:before="160" w:after="160" w:line="360" w:lineRule="auto"/>
+        <w:jc w:val="center"/>
+        <w:rPr>
+          <w:bCs w:val="0"/>
+          <w:iCs/>
+          <w:sz w:val="20"/>
+          <w:szCs w:val="20"/>
+        </w:rPr>
+      </w:pPr>
+      <w:r>
+        <w:rPr>
+          <w:bCs w:val="0"/>
+          <w:iCs/>
+          <w:sz w:val="20"/>
+          <w:szCs w:val="20"/>
+        </w:rPr>
+        <w:t xml:space="preserve">Fonte: </w:t>
+      </w:r>
+      <w:r>
+        <w:rPr>
+          <w:bCs w:val="0"/>
+          <w:iCs/>
+          <w:sz w:val="20"/>
+          <w:szCs w:val="20"/>
+        </w:rPr>
+        <w:t>site oficial do Expo</w:t>
+      </w:r>
+    </w:p>
+    <w:p>
+      <w:pPr>
+        <w:autoSpaceDE w:val="0"/>
+        <w:spacing w:before="160" w:after="160" w:line="360" w:lineRule="auto"/>
+        <w:jc w:val="both"/>
+        <w:rPr>
+          <w:bCs w:val="0"/>
+        </w:rPr>
+      </w:pPr>
+      <w:r>
+        <w:rPr>
+          <w:bCs w:val="0"/>
+        </w:rPr>
+        <w:t>O aplicativo irá consumir a API exposta da AWS para receber dados e gerar gráficos e métricas atualizadas</w:t>
+      </w:r>
+      <w:r>
+        <w:rPr>
+          <w:bCs w:val="0"/>
+        </w:rPr>
+        <w:t>.</w:t>
+      </w:r>
+    </w:p>
+    <w:p>
+      <w:pPr>
+        <w:autoSpaceDE w:val="0"/>
+        <w:spacing w:before="160" w:after="160" w:line="360" w:lineRule="auto"/>
+        <w:jc w:val="both"/>
+        <w:rPr>
+          <w:bCs w:val="0"/>
+        </w:rPr>
+      </w:pPr>
+      <w:r>
+        <w:rPr>
+          <w:bCs w:val="0"/>
+        </w:rPr>
+        <w:t>Considerando o setor da saúde, é imprescindível que determinados fatores são cruciais quando se entende o ambiente que softwares irão estar em produção, portanto é importante ter em mente que um sistema desenvolvido para ambientes críticos deve ter:</w:t>
+      </w:r>
+    </w:p>
+    <w:p>
+      <w:pPr>
+        <w:autoSpaceDE w:val="0"/>
+        <w:spacing w:before="160" w:after="160" w:line="360" w:lineRule="auto"/>
+        <w:jc w:val="both"/>
+        <w:rPr>
+          <w:bCs w:val="0"/>
+        </w:rPr>
+      </w:pPr>
+      <w:r>
+        <w:rPr>
+          <w:bCs w:val="0"/>
+        </w:rPr>
+        <w:t>- Confiabilidade</w:t>
+      </w:r>
+    </w:p>
+    <w:p>
+      <w:pPr>
+        <w:autoSpaceDE w:val="0"/>
+        <w:spacing w:before="160" w:after="160" w:line="360" w:lineRule="auto"/>
+        <w:jc w:val="both"/>
+        <w:rPr>
+          <w:bCs w:val="0"/>
+        </w:rPr>
+      </w:pPr>
+      <w:r>
+        <w:rPr>
+          <w:bCs w:val="0"/>
+        </w:rPr>
+        <w:t>- Acessibilidade</w:t>
+      </w:r>
+    </w:p>
+    <w:p>
+      <w:pPr>
+        <w:autoSpaceDE w:val="0"/>
+        <w:spacing w:before="160" w:after="160" w:line="360" w:lineRule="auto"/>
+        <w:jc w:val="both"/>
+        <w:rPr>
+          <w:bCs w:val="0"/>
+        </w:rPr>
+      </w:pPr>
+      <w:r>
+        <w:rPr>
+          <w:bCs w:val="0"/>
+        </w:rPr>
+        <w:t>- Multiplataforma</w:t>
+      </w:r>
+    </w:p>
+    <w:p>
+      <w:pPr>
+        <w:autoSpaceDE w:val="0"/>
+        <w:spacing w:before="160" w:after="160" w:line="360" w:lineRule="auto"/>
+        <w:jc w:val="both"/>
+        <w:rPr>
+          <w:bCs w:val="0"/>
+        </w:rPr>
+      </w:pPr>
+      <w:r>
+        <w:rPr>
+          <w:bCs w:val="0"/>
+        </w:rPr>
+        <w:t>- Intuitividade</w:t>
+      </w:r>
+    </w:p>
+    <w:p>
+      <w:pPr>
+        <w:autoSpaceDE w:val="0"/>
+        <w:spacing w:before="160" w:after="160" w:line="360" w:lineRule="auto"/>
+        <w:jc w:val="both"/>
+        <w:rPr>
+          <w:bCs w:val="0"/>
+        </w:rPr>
+      </w:pPr>
+      <w:r>
+        <w:rPr>
+          <w:bCs w:val="0"/>
+        </w:rPr>
+        <w:t xml:space="preserve">Explicando a implementação de cada um desses pilares no desenvolvimento de software crítico, um aplicativo para a área da saúde deve ter a garantia de que não terá falhas </w:t>
+      </w:r>
+      <w:r>
+        <w:rPr>
+          <w:bCs w:val="0"/>
+        </w:rPr>
+        <w:t xml:space="preserve">quando surgir a necessidade de usá-lo. </w:t>
+      </w:r>
+    </w:p>
+    <w:p>
+      <w:pPr>
+        <w:autoSpaceDE w:val="0"/>
+        <w:spacing w:before="160" w:after="160" w:line="360" w:lineRule="auto"/>
+        <w:jc w:val="both"/>
+        <w:rPr>
+          <w:bCs w:val="0"/>
+        </w:rPr>
+      </w:pPr>
+      <w:r>
+        <w:rPr>
+          <w:bCs w:val="0"/>
+        </w:rPr>
+        <w:lastRenderedPageBreak/>
+        <w:t xml:space="preserve">Ele também deve ter uma interface clara e pensada de forma que se consiga transmitir tudo aquilo que é mais importante de forma rápida e sem margem para interpretações equivocadas. </w:t>
+      </w:r>
+    </w:p>
+    <w:p>
+      <w:pPr>
+        <w:autoSpaceDE w:val="0"/>
+        <w:spacing w:before="160" w:after="160" w:line="360" w:lineRule="auto"/>
+        <w:jc w:val="both"/>
+        <w:rPr>
+          <w:bCs w:val="0"/>
+        </w:rPr>
+      </w:pPr>
+      <w:proofErr w:type="gramStart"/>
+      <w:r>
+        <w:rPr>
+          <w:bCs w:val="0"/>
+        </w:rPr>
+        <w:t>E além disso</w:t>
+      </w:r>
+      <w:proofErr w:type="gramEnd"/>
+      <w:r>
+        <w:rPr>
+          <w:bCs w:val="0"/>
+        </w:rPr>
+        <w:t>, ele deve ser capaz de ser exibido em diferentes plataformas, de modo que independente do dispositivo ou sistema operacional, o aplicativo conseguirá oferecer assistência ao gestor com a mesma eficiência.</w:t>
+      </w:r>
+    </w:p>
+    <w:p>
+      <w:pPr>
+        <w:autoSpaceDE w:val="0"/>
+        <w:spacing w:before="160" w:after="160" w:line="360" w:lineRule="auto"/>
+        <w:jc w:val="both"/>
+        <w:rPr>
+          <w:bCs w:val="0"/>
+        </w:rPr>
+      </w:pPr>
+      <w:r>
+        <w:rPr>
+          <w:bCs w:val="0"/>
+        </w:rPr>
+        <w:t>Portanto, com base nesses princípios, foi feita a escolha das tecnologias que foram usadas para o desenvolvimento do aplicativo e da interface web.</w:t>
+      </w:r>
+    </w:p>
+    <w:p>
+      <w:pPr>
+        <w:autoSpaceDE w:val="0"/>
+        <w:spacing w:before="160" w:after="160" w:line="360" w:lineRule="auto"/>
+        <w:jc w:val="both"/>
+        <w:rPr>
+          <w:bCs w:val="0"/>
+          <w:iCs/>
+        </w:rPr>
+      </w:pPr>
+    </w:p>
     <w:sectPr>
-      <w:headerReference w:type="even" r:id="rId12"/>
-      <w:headerReference w:type="default" r:id="rId13"/>
-      <w:footerReference w:type="even" r:id="rId14"/>
-      <w:footerReference w:type="default" r:id="rId15"/>
-      <w:headerReference w:type="first" r:id="rId16"/>
-      <w:footerReference w:type="first" r:id="rId17"/>
+      <w:headerReference w:type="even" r:id="rId16"/>
+      <w:headerReference w:type="default" r:id="rId17"/>
+      <w:footerReference w:type="even" r:id="rId18"/>
+      <w:footerReference w:type="default" r:id="rId19"/>
+      <w:headerReference w:type="first" r:id="rId20"/>
+      <w:footerReference w:type="first" r:id="rId21"/>
       <w:pgSz w:w="11906" w:h="16838" w:code="9"/>
       <w:pgMar w:top="1701" w:right="1134" w:bottom="1134" w:left="1701" w:header="1134" w:footer="1134" w:gutter="0"/>
       <w:cols w:space="720"/>
@@ -2972,6 +3777,7 @@
   <w:style w:type="character" w:default="1" w:styleId="Fontepargpadro">
     <w:name w:val="Default Paragraph Font"/>
     <w:uiPriority w:val="1"/>
+    <w:semiHidden/>
     <w:unhideWhenUsed/>
   </w:style>
   <w:style w:type="table" w:default="1" w:styleId="Tabelanormal">

</xml_diff>